<commit_message>
Updated multiple language resources with extensive content revisions and metadata cleanup across 1739 files.
</commit_message>
<xml_diff>
--- a/eng/docx/018.content.docx
+++ b/eng/docx/018.content.docx
@@ -29393,6 +29393,87 @@
           <w:lang w:val="en_US" w:bidi="en_US"/>
         </w:rPr>
         <w:t>Bible, Inspiration of the</w:t>
+      </w:r>
+      <w:r>
+        <w:rPr>
+          <w:lang w:val="en_US" w:bidi="en_US"/>
+        </w:rPr>
+        <w:t>.</w:t>
+      </w:r>
+      <w:r>
+        <w:rPr>
+          <w:lang w:val="en_US" w:bidi="en_US"/>
+        </w:rPr>
+      </w:r>
+      <w:r>
+        <w:rPr>
+          <w:lang w:val="en_US" w:bidi="en_US"/>
+        </w:rPr>
+      </w:r>
+    </w:p>
+    <w:p>
+      <w:pPr/>
+      <w:r>
+        <w:rPr>
+          <w:lang w:val="en_US" w:bidi="en_US"/>
+        </w:rPr>
+      </w:r>
+    </w:p>
+    <w:p>
+      <w:pPr>
+        <w:pStyle w:val="Heading2"/>
+      </w:pPr>
+      <w:r>
+        <w:rPr>
+          <w:lang w:val="en_US" w:bidi="en_US"/>
+        </w:rPr>
+        <w:t>The Revelation of John</w:t>
+      </w:r>
+      <w:r>
+        <w:rPr>
+          <w:lang w:val="en_US" w:bidi="en_US"/>
+        </w:rPr>
+      </w:r>
+    </w:p>
+    <w:p>
+      <w:pPr/>
+      <w:r>
+        <w:rPr>
+          <w:lang w:val="en_US" w:bidi="en_US"/>
+        </w:rPr>
+      </w:r>
+      <w:r>
+        <w:rPr>
+          <w:lang w:val="en_US" w:bidi="en_US"/>
+        </w:rPr>
+        <w:t xml:space="preserve">Another name for the book of Revelation. </w:t>
+      </w:r>
+    </w:p>
+    <w:p>
+      <w:pPr/>
+      <w:r>
+        <w:rPr>
+          <w:lang w:val="en_US" w:bidi="en_US"/>
+        </w:rPr>
+      </w:r>
+      <w:r>
+        <w:rPr>
+          <w:i/>
+          <w:lang w:val="en_US" w:bidi="en_US"/>
+        </w:rPr>
+        <w:t>See</w:t>
+      </w:r>
+      <w:r>
+        <w:rPr>
+          <w:lang w:val="en_US" w:bidi="en_US"/>
+        </w:rPr>
+        <w:t xml:space="preserve"> </w:t>
+      </w:r>
+      <w:r>
+        <w:rPr>
+          <w:lang w:val="en_US" w:bidi="en_US"/>
+        </w:rPr>
+        <w:t>Revelation, Book of</w:t>
       </w:r>
       <w:r>
         <w:rPr>

</xml_diff>